<commit_message>
Add screenshots to the Word manual; no t-stat on a constant series
Co-Authored-By: Claude Opus 5.5 <noreply@anthropic.com>
</commit_message>
<xml_diff>
--- a/docs/使用手册.docx
+++ b/docs/使用手册.docx
@@ -187,6 +187,59 @@
     </w:p>
     <w:p>
       <w:pPr>
+        <w:jc w:val="center"/>
+      </w:pPr>
+      <w:r>
+        <w:drawing>
+          <wp:inline xmlns:a="http://schemas.openxmlformats.org/drawingml/2006/main" xmlns:pic="http://schemas.openxmlformats.org/drawingml/2006/picture">
+            <wp:extent cx="5760000" cy="6545455"/>
+            <wp:docPr id="1" name="Picture 1"/>
+            <wp:cNvGraphicFramePr>
+              <a:graphicFrameLocks noChangeAspect="1"/>
+            </wp:cNvGraphicFramePr>
+            <a:graphic>
+              <a:graphicData uri="http://schemas.openxmlformats.org/drawingml/2006/picture">
+                <pic:pic>
+                  <pic:nvPicPr>
+                    <pic:cNvPr id="0" name="home.png"/>
+                    <pic:cNvPicPr/>
+                  </pic:nvPicPr>
+                  <pic:blipFill>
+                    <a:blip r:embed="rId9"/>
+                    <a:stretch>
+                      <a:fillRect/>
+                    </a:stretch>
+                  </pic:blipFill>
+                  <pic:spPr>
+                    <a:xfrm>
+                      <a:off x="0" y="0"/>
+                      <a:ext cx="5760000" cy="6545455"/>
+                    </a:xfrm>
+                    <a:prstGeom prst="rect"/>
+                  </pic:spPr>
+                </pic:pic>
+              </a:graphicData>
+            </a:graphic>
+          </wp:inline>
+        </w:drawing>
+      </w:r>
+    </w:p>
+    <w:p>
+      <w:pPr>
+        <w:jc w:val="center"/>
+      </w:pPr>
+      <w:r>
+        <w:rPr>
+          <w:rFonts w:ascii="Aptos" w:hAnsi="Aptos" w:eastAsia="Microsoft YaHei"/>
+          <w:b w:val="0"/>
+          <w:color w:val="555555"/>
+          <w:sz w:val="18"/>
+        </w:rPr>
+        <w:t>图 1  首页：从上到下依次是四个步骤</w:t>
+      </w:r>
+    </w:p>
+    <w:p>
+      <w:pPr>
         <w:pStyle w:val="Heading2"/>
       </w:pPr>
       <w:r>
@@ -220,7 +273,7 @@
           <w:color w:val="000000"/>
           <w:sz w:val="21"/>
         </w:rPr>
-        <w:t>可以选择试运行数据、本机已有 qwb 数据、上传 CSV，或使用 Tushare 兼容接口下载。试运行数据只用于熟悉流程，几秒完成，结果没有投资含义。</w:t>
+        <w:t>可以选择试运行数据、本机已有 qwb 数据、上传 CSV，或使用 Tushare 兼容接口下载。试运行数据只用于熟悉流程，几秒完成，结果没有投资含义，也不计入评估台账。</w:t>
       </w:r>
     </w:p>
     <w:p>
@@ -259,6 +312,59 @@
           <w:sz w:val="21"/>
         </w:rPr>
         <w:t>点击开始训练。网页只生成 YAML 并提交本地任务，训练逻辑与命令行相同。任务页面显示状态、进度、日志和结果文件夹。</w:t>
+      </w:r>
+    </w:p>
+    <w:p>
+      <w:pPr>
+        <w:jc w:val="center"/>
+      </w:pPr>
+      <w:r>
+        <w:drawing>
+          <wp:inline xmlns:a="http://schemas.openxmlformats.org/drawingml/2006/main" xmlns:pic="http://schemas.openxmlformats.org/drawingml/2006/picture">
+            <wp:extent cx="5760000" cy="4712727"/>
+            <wp:docPr id="2" name="Picture 2"/>
+            <wp:cNvGraphicFramePr>
+              <a:graphicFrameLocks noChangeAspect="1"/>
+            </wp:cNvGraphicFramePr>
+            <a:graphic>
+              <a:graphicData uri="http://schemas.openxmlformats.org/drawingml/2006/picture">
+                <pic:pic>
+                  <pic:nvPicPr>
+                    <pic:cNvPr id="0" name="result.png"/>
+                    <pic:cNvPicPr/>
+                  </pic:nvPicPr>
+                  <pic:blipFill>
+                    <a:blip r:embed="rId10"/>
+                    <a:stretch>
+                      <a:fillRect/>
+                    </a:stretch>
+                  </pic:blipFill>
+                  <pic:spPr>
+                    <a:xfrm>
+                      <a:off x="0" y="0"/>
+                      <a:ext cx="5760000" cy="4712727"/>
+                    </a:xfrm>
+                    <a:prstGeom prst="rect"/>
+                  </pic:spPr>
+                </pic:pic>
+              </a:graphicData>
+            </a:graphic>
+          </wp:inline>
+        </w:drawing>
+      </w:r>
+    </w:p>
+    <w:p>
+      <w:pPr>
+        <w:jc w:val="center"/>
+      </w:pPr>
+      <w:r>
+        <w:rPr>
+          <w:rFonts w:ascii="Aptos" w:hAnsi="Aptos" w:eastAsia="Microsoft YaHei"/>
+          <w:b w:val="0"/>
+          <w:color w:val="555555"/>
+          <w:sz w:val="18"/>
+        </w:rPr>
+        <w:t>图 2  结果页：先看“一句话结论”，再看扣成本后的表格</w:t>
       </w:r>
     </w:p>
     <w:p>
@@ -918,7 +1024,7 @@
       </w:r>
     </w:p>
     <w:sectPr>
-      <w:footerReference w:type="default" r:id="rId9"/>
+      <w:footerReference w:type="default" r:id="rId11"/>
       <w:pgSz w:w="12240" w:h="15840"/>
       <w:pgMar w:top="1020" w:right="1134" w:bottom="1020" w:left="1134" w:header="720" w:footer="720" w:gutter="0"/>
       <w:cols w:space="720"/>

</xml_diff>

<commit_message>
Step 1 picks where the model is used; step 3 follows from it
Scenario: market, holding period (1/5/20 days), universe (all, ex-ST, ST,
CSI 300/500/1000 as of each date, custom list), capital tier (seven bands),
long-only, and model (LightGBM or Ridge; XGBoost and Kronos shown as planned).
The capital tier sets holdings and a liquidity floor (each position at most
5% of 20-day ADV). Ridge runs through the same walk-forward, checks and
net-of-cost test. Index constituents come from index_weight snapshots.

Co-Authored-By: Claude Opus 5.5 <noreply@anthropic.com>
</commit_message>
<xml_diff>
--- a/docs/使用手册.docx
+++ b/docs/使用手册.docx
@@ -192,7 +192,7 @@
       <w:r>
         <w:drawing>
           <wp:inline xmlns:a="http://schemas.openxmlformats.org/drawingml/2006/main" xmlns:pic="http://schemas.openxmlformats.org/drawingml/2006/picture">
-            <wp:extent cx="5760000" cy="6545455"/>
+            <wp:extent cx="5760000" cy="12567273"/>
             <wp:docPr id="1" name="Picture 1"/>
             <wp:cNvGraphicFramePr>
               <a:graphicFrameLocks noChangeAspect="1"/>
@@ -213,7 +213,7 @@
                   <pic:spPr>
                     <a:xfrm>
                       <a:off x="0" y="0"/>
-                      <a:ext cx="5760000" cy="6545455"/>
+                      <a:ext cx="5760000" cy="12567273"/>
                     </a:xfrm>
                     <a:prstGeom prst="rect"/>
                   </pic:spPr>
@@ -243,7 +243,7 @@
         <w:pStyle w:val="Heading2"/>
       </w:pPr>
       <w:r>
-        <w:t>第 1 步 选择要打造的模型</w:t>
+        <w:t>第 1 步 要打造什么模型：用在哪</w:t>
       </w:r>
     </w:p>
     <w:p>
@@ -254,7 +254,7 @@
           <w:color w:val="000000"/>
           <w:sz w:val="21"/>
         </w:rPr>
-        <w:t>首版提供全 A 股选股和 ST 股专题。任务卡已经固定预测对象、开仓时点、持有期和验收指标。</w:t>
+        <w:t>先说清楚模型要用在哪里，后面的数据要求和参数都由这一步决定：市场（目前 A 股）、持有期（1 天 / 5 天 / 20 天）、股票池（全 A 股、剔除 ST、只要 ST、沪深 300 / 中证 500 / 中证 1000 成分股、自选名单）、资金量（0–30 万、30–100 万、100–600 万、600 万–1000 万、1000 万–1 亿、1 亿–5 亿、5 亿及以上）、交易方式（只做多）和模型（LightGBM 或 Ridge）。灰色选项是规划中，暂时不能选。资金量决定持股只数和最低成交额：每只仓位不超过该股近 20 日日均成交额的 5%，资金越大，能选的股票越少。指数成分股按每个历史时点当时的成分取。</w:t>
       </w:r>
     </w:p>
     <w:p>
@@ -281,7 +281,7 @@
         <w:pStyle w:val="Heading2"/>
       </w:pPr>
       <w:r>
-        <w:t>第 3 步 参数</w:t>
+        <w:t>第 3 步 参数（由第 1 步推出）</w:t>
       </w:r>
     </w:p>
     <w:p>
@@ -292,7 +292,7 @@
           <w:color w:val="000000"/>
           <w:sz w:val="21"/>
         </w:rPr>
-        <w:t>不改参数即可使用默认值。高级参数包括树数量、叶子数、学习率、种子数、买入比例和佣金。改过的值会列在报告首页。</w:t>
+        <w:t>参数由第 1 步推出，页面会列出“因为你选了什么，所以默认怎样训练”。可以改持股只数和佣金；选 LightGBM 时可改树数量、叶子数、学习率、种子数，选 Ridge 时可改正则强度。改动过的值会列在报告首页，便于复核。最终测试年份会根据数据的最后年份自动选择。</w:t>
       </w:r>
     </w:p>
     <w:p>

</xml_diff>

<commit_message>
Step 2: datasets made of several sources
A combined dataset sits on a base dataset and adds sources: factor tables
(each numeric column becomes a feature), extra or overriding bars, and ST
flags, from CSV or from Tushare daily_basic / moneyflow. Each source states
when its data is usable (after the close, next day, or by announcement date);
rows are moved to that trading day on import, so the look-ahead check covers
added features too. Overlapping bars are checked against the base first.

Co-Authored-By: Claude Opus 5.5 <noreply@anthropic.com>
</commit_message>
<xml_diff>
--- a/docs/使用手册.docx
+++ b/docs/使用手册.docx
@@ -274,6 +274,25 @@
           <w:sz w:val="21"/>
         </w:rPr>
         <w:t>可以选择试运行数据、本机已有 qwb 数据、上传 CSV，或使用 Tushare 兼容接口下载。试运行数据只用于熟悉流程，几秒完成，结果没有投资含义，也不计入评估台账。</w:t>
+      </w:r>
+    </w:p>
+    <w:p>
+      <w:pPr>
+        <w:pStyle w:val="Heading2"/>
+      </w:pPr>
+      <w:r>
+        <w:t>多个数据来源</w:t>
+      </w:r>
+    </w:p>
+    <w:p>
+      <w:r>
+        <w:rPr>
+          <w:rFonts w:ascii="Aptos" w:hAnsi="Aptos" w:eastAsia="Microsoft YaHei"/>
+          <w:b w:val="0"/>
+          <w:color w:val="000000"/>
+          <w:sz w:val="21"/>
+        </w:rPr>
+        <w:t>一份数据可以叠加多个来源，本地 CSV 和 API 可以混用：在第 2 步数据后面点“加更多数据来源”，系统会以原数据为基础新建一份组合数据，原数据保持不变。每添加一个来源，先选它是什么（因子/指标、补充行情、ST 标记），再说明数据什么时候能拿到：当天收盘后、次日开盘后，或按公告日。系统按这个时间把每一行放到它真正能用的那一天，防止用到未来数据；因子的每一列都会作为模型特征。补充行情和已有行情重叠时，会先核对收盘价，口径不一致会拒绝导入。也可以直接从 Tushare 拉取每日指标（daily_basic：换手率、E/P、B/P、股息率、流通市值）和资金流（moneyflow）。</w:t>
       </w:r>
     </w:p>
     <w:p>

</xml_diff>